<commit_message>
Actualización de Evidencias Proyecto
Se actualizó los documentos Evidencias de Documentación.docx y Evidencias del Sistema.docx de Evidencias Proyecto. También se corrigió una dependencia del requirements.txt.

Co-Authored-By: warfromo <136270658+warfromo@users.noreply.github.com>
</commit_message>
<xml_diff>
--- a/Fase 2/Evidencias Proyecto/Evidencias del Sistema.docx
+++ b/Fase 2/Evidencias Proyecto/Evidencias del Sistema.docx
@@ -424,12 +424,12 @@
           <wp:inline distB="114300" distT="114300" distL="114300" distR="114300">
             <wp:extent cx="5731200" cy="2844800"/>
             <wp:effectExtent b="0" l="0" r="0" t="0"/>
-            <wp:docPr id="8" name="image4.png"/>
+            <wp:docPr id="8" name="image2.png"/>
             <a:graphic>
               <a:graphicData uri="http://schemas.openxmlformats.org/drawingml/2006/picture">
                 <pic:pic>
                   <pic:nvPicPr>
-                    <pic:cNvPr id="0" name="image4.png"/>
+                    <pic:cNvPr id="0" name="image2.png"/>
                     <pic:cNvPicPr preferRelativeResize="0"/>
                   </pic:nvPicPr>
                   <pic:blipFill>
@@ -484,12 +484,12 @@
           <wp:inline distB="114300" distT="114300" distL="114300" distR="114300">
             <wp:extent cx="5731200" cy="2895600"/>
             <wp:effectExtent b="0" l="0" r="0" t="0"/>
-            <wp:docPr id="4" name="image2.png"/>
+            <wp:docPr id="4" name="image4.png"/>
             <a:graphic>
               <a:graphicData uri="http://schemas.openxmlformats.org/drawingml/2006/picture">
                 <pic:pic>
                   <pic:nvPicPr>
-                    <pic:cNvPr id="0" name="image2.png"/>
+                    <pic:cNvPr id="0" name="image4.png"/>
                     <pic:cNvPicPr preferRelativeResize="0"/>
                   </pic:nvPicPr>
                   <pic:blipFill>
@@ -544,12 +544,12 @@
           <wp:inline distB="114300" distT="114300" distL="114300" distR="114300">
             <wp:extent cx="5731200" cy="2197100"/>
             <wp:effectExtent b="0" l="0" r="0" t="0"/>
-            <wp:docPr id="7" name="image8.png"/>
+            <wp:docPr id="7" name="image5.png"/>
             <a:graphic>
               <a:graphicData uri="http://schemas.openxmlformats.org/drawingml/2006/picture">
                 <pic:pic>
                   <pic:nvPicPr>
-                    <pic:cNvPr id="0" name="image8.png"/>
+                    <pic:cNvPr id="0" name="image5.png"/>
                     <pic:cNvPicPr preferRelativeResize="0"/>
                   </pic:nvPicPr>
                   <pic:blipFill>
@@ -651,12 +651,12 @@
           <wp:inline distB="114300" distT="114300" distL="114300" distR="114300">
             <wp:extent cx="5731200" cy="2857500"/>
             <wp:effectExtent b="0" l="0" r="0" t="0"/>
-            <wp:docPr id="5" name="image3.png"/>
+            <wp:docPr id="5" name="image8.png"/>
             <a:graphic>
               <a:graphicData uri="http://schemas.openxmlformats.org/drawingml/2006/picture">
                 <pic:pic>
                   <pic:nvPicPr>
-                    <pic:cNvPr id="0" name="image3.png"/>
+                    <pic:cNvPr id="0" name="image8.png"/>
                     <pic:cNvPicPr preferRelativeResize="0"/>
                   </pic:nvPicPr>
                   <pic:blipFill>
@@ -900,12 +900,12 @@
           <wp:inline distB="114300" distT="114300" distL="114300" distR="114300">
             <wp:extent cx="5731200" cy="2768600"/>
             <wp:effectExtent b="0" l="0" r="0" t="0"/>
-            <wp:docPr id="2" name="image5.png"/>
+            <wp:docPr id="2" name="image7.png"/>
             <a:graphic>
               <a:graphicData uri="http://schemas.openxmlformats.org/drawingml/2006/picture">
                 <pic:pic>
                   <pic:nvPicPr>
-                    <pic:cNvPr id="0" name="image5.png"/>
+                    <pic:cNvPr id="0" name="image7.png"/>
                     <pic:cNvPicPr preferRelativeResize="0"/>
                   </pic:nvPicPr>
                   <pic:blipFill>
@@ -960,12 +960,12 @@
           <wp:inline distB="114300" distT="114300" distL="114300" distR="114300">
             <wp:extent cx="5731200" cy="2794000"/>
             <wp:effectExtent b="0" l="0" r="0" t="0"/>
-            <wp:docPr id="3" name="image6.png"/>
+            <wp:docPr id="3" name="image3.png"/>
             <a:graphic>
               <a:graphicData uri="http://schemas.openxmlformats.org/drawingml/2006/picture">
                 <pic:pic>
                   <pic:nvPicPr>
-                    <pic:cNvPr id="0" name="image6.png"/>
+                    <pic:cNvPr id="0" name="image3.png"/>
                     <pic:cNvPicPr preferRelativeResize="0"/>
                   </pic:nvPicPr>
                   <pic:blipFill>
@@ -1020,12 +1020,12 @@
           <wp:inline distB="114300" distT="114300" distL="114300" distR="114300">
             <wp:extent cx="5731200" cy="2921000"/>
             <wp:effectExtent b="0" l="0" r="0" t="0"/>
-            <wp:docPr id="6" name="image7.png"/>
+            <wp:docPr id="6" name="image9.png"/>
             <a:graphic>
               <a:graphicData uri="http://schemas.openxmlformats.org/drawingml/2006/picture">
                 <pic:pic>
                   <pic:nvPicPr>
-                    <pic:cNvPr id="0" name="image7.png"/>
+                    <pic:cNvPr id="0" name="image9.png"/>
                     <pic:cNvPicPr preferRelativeResize="0"/>
                   </pic:nvPicPr>
                   <pic:blipFill>
@@ -1344,12 +1344,12 @@
           <wp:inline distB="114300" distT="114300" distL="114300" distR="114300">
             <wp:extent cx="5731200" cy="4432300"/>
             <wp:effectExtent b="0" l="0" r="0" t="0"/>
-            <wp:docPr id="1" name="image1.png"/>
+            <wp:docPr id="1" name="image6.png"/>
             <a:graphic>
               <a:graphicData uri="http://schemas.openxmlformats.org/drawingml/2006/picture">
                 <pic:pic>
                   <pic:nvPicPr>
-                    <pic:cNvPr id="0" name="image1.png"/>
+                    <pic:cNvPr id="0" name="image6.png"/>
                     <pic:cNvPicPr preferRelativeResize="0"/>
                   </pic:nvPicPr>
                   <pic:blipFill>
@@ -1501,12 +1501,12 @@
           <wp:inline distB="114300" distT="114300" distL="114300" distR="114300">
             <wp:extent cx="5731200" cy="2870200"/>
             <wp:effectExtent b="0" l="0" r="0" t="0"/>
-            <wp:docPr id="9" name="image9.png"/>
+            <wp:docPr id="9" name="image1.png"/>
             <a:graphic>
               <a:graphicData uri="http://schemas.openxmlformats.org/drawingml/2006/picture">
                 <pic:pic>
                   <pic:nvPicPr>
-                    <pic:cNvPr id="0" name="image9.png"/>
+                    <pic:cNvPr id="0" name="image1.png"/>
                     <pic:cNvPicPr preferRelativeResize="0"/>
                   </pic:nvPicPr>
                   <pic:blipFill>

</xml_diff>